<commit_message>
fix documentation navigation and modernize manuals
</commit_message>
<xml_diff>
--- a/apps/web/public/documentation/library/files/MONOREPO-AUDIT-REPORT.docx
+++ b/apps/web/public/documentation/library/files/MONOREPO-AUDIT-REPORT.docx
@@ -67,9 +67,11 @@
       <w:pPr>
         <w:pStyle w:val="Heading1"/>
       </w:pPr>
+      <w:bookmarkStart w:id="1" w:name="document_control"/>
       <w:r>
         <w:t>Document Control</w:t>
       </w:r>
+      <w:bookmarkEnd w:id="1"/>
     </w:p>
     <w:tbl>
       <w:tblPr>
@@ -250,7 +252,483 @@
     </w:tbl>
     <w:p>
       <w:r>
-        <w:t>Navigation note: use Word's Navigation Pane to move through the heading hierarchy. The source document's linked table of contents is retained below.</w:t>
+        <w:t>Use the linked table of contents below or Word's Navigation Pane to move through this document.</w:t>
+      </w:r>
+    </w:p>
+    <w:p>
+      <w:pPr>
+        <w:pStyle w:val="Heading1"/>
+      </w:pPr>
+      <w:bookmarkStart w:id="2" w:name="table_of_contents"/>
+      <w:r>
+        <w:t>Table of Contents</w:t>
+      </w:r>
+      <w:bookmarkEnd w:id="2"/>
+    </w:p>
+    <w:p>
+      <w:pPr>
+        <w:spacing w:after="60"/>
+      </w:pPr>
+      <w:hyperlink w:anchor="document_control">
+        <w:r>
+          <w:rPr>
+            <w:rStyle w:val="Hyperlink"/>
+          </w:rPr>
+          <w:t>Document Control</w:t>
+        </w:r>
+      </w:hyperlink>
+    </w:p>
+    <w:p>
+      <w:pPr>
+        <w:spacing w:after="60"/>
+        <w:ind w:left="317"/>
+      </w:pPr>
+      <w:hyperlink w:anchor="section_001">
+        <w:r>
+          <w:rPr>
+            <w:rStyle w:val="Hyperlink"/>
+          </w:rPr>
+          <w:t>Public (no auth required) — 9 pages</w:t>
+        </w:r>
+      </w:hyperlink>
+    </w:p>
+    <w:p>
+      <w:pPr>
+        <w:spacing w:after="60"/>
+        <w:ind w:left="317"/>
+      </w:pPr>
+      <w:hyperlink w:anchor="section_002">
+        <w:r>
+          <w:rPr>
+            <w:rStyle w:val="Hyperlink"/>
+          </w:rPr>
+          <w:t>Authenticated (workspace layout) — 30 pages</w:t>
+        </w:r>
+      </w:hyperlink>
+    </w:p>
+    <w:p>
+      <w:pPr>
+        <w:spacing w:after="60"/>
+        <w:ind w:left="0"/>
+      </w:pPr>
+      <w:hyperlink w:anchor="section_003">
+        <w:r>
+          <w:rPr>
+            <w:rStyle w:val="Hyperlink"/>
+          </w:rPr>
+          <w:t>2. Backend API Endpoints</w:t>
+        </w:r>
+      </w:hyperlink>
+    </w:p>
+    <w:p>
+      <w:pPr>
+        <w:spacing w:after="60"/>
+        <w:ind w:left="317"/>
+      </w:pPr>
+      <w:hyperlink w:anchor="section_004">
+        <w:r>
+          <w:rPr>
+            <w:rStyle w:val="Hyperlink"/>
+          </w:rPr>
+          <w:t>Health (public, no auth)</w:t>
+        </w:r>
+      </w:hyperlink>
+    </w:p>
+    <w:p>
+      <w:pPr>
+        <w:spacing w:after="60"/>
+        <w:ind w:left="317"/>
+      </w:pPr>
+      <w:hyperlink w:anchor="section_005">
+        <w:r>
+          <w:rPr>
+            <w:rStyle w:val="Hyperlink"/>
+          </w:rPr>
+          <w:t>Auth (public, no auth)</w:t>
+        </w:r>
+      </w:hyperlink>
+    </w:p>
+    <w:p>
+      <w:pPr>
+        <w:spacing w:after="60"/>
+        <w:ind w:left="317"/>
+      </w:pPr>
+      <w:hyperlink w:anchor="section_006">
+        <w:r>
+          <w:rPr>
+            <w:rStyle w:val="Hyperlink"/>
+          </w:rPr>
+          <w:t>Public Storefront</w:t>
+        </w:r>
+      </w:hyperlink>
+    </w:p>
+    <w:p>
+      <w:pPr>
+        <w:spacing w:after="60"/>
+        <w:ind w:left="317"/>
+      </w:pPr>
+      <w:hyperlink w:anchor="section_007">
+        <w:r>
+          <w:rPr>
+            <w:rStyle w:val="Hyperlink"/>
+          </w:rPr>
+          <w:t>Customer Portal (portal auth)</w:t>
+        </w:r>
+      </w:hyperlink>
+    </w:p>
+    <w:p>
+      <w:pPr>
+        <w:spacing w:after="60"/>
+        <w:ind w:left="317"/>
+      </w:pPr>
+      <w:hyperlink w:anchor="section_008">
+        <w:r>
+          <w:rPr>
+            <w:rStyle w:val="Hyperlink"/>
+          </w:rPr>
+          <w:t>Core Business CRUD (authenticated, permission-gated)</w:t>
+        </w:r>
+      </w:hyperlink>
+    </w:p>
+    <w:p>
+      <w:pPr>
+        <w:spacing w:after="60"/>
+        <w:ind w:left="317"/>
+      </w:pPr>
+      <w:hyperlink w:anchor="section_009">
+        <w:r>
+          <w:rPr>
+            <w:rStyle w:val="Hyperlink"/>
+          </w:rPr>
+          <w:t>CRM &amp; Marketing</w:t>
+        </w:r>
+      </w:hyperlink>
+    </w:p>
+    <w:p>
+      <w:pPr>
+        <w:spacing w:after="60"/>
+        <w:ind w:left="317"/>
+      </w:pPr>
+      <w:hyperlink w:anchor="section_010">
+        <w:r>
+          <w:rPr>
+            <w:rStyle w:val="Hyperlink"/>
+          </w:rPr>
+          <w:t>AI &amp; Knowledge</w:t>
+        </w:r>
+      </w:hyperlink>
+    </w:p>
+    <w:p>
+      <w:pPr>
+        <w:spacing w:after="60"/>
+        <w:ind w:left="317"/>
+      </w:pPr>
+      <w:hyperlink w:anchor="section_011">
+        <w:r>
+          <w:rPr>
+            <w:rStyle w:val="Hyperlink"/>
+          </w:rPr>
+          <w:t>Automation &amp; Workflows</w:t>
+        </w:r>
+      </w:hyperlink>
+    </w:p>
+    <w:p>
+      <w:pPr>
+        <w:spacing w:after="60"/>
+        <w:ind w:left="317"/>
+      </w:pPr>
+      <w:hyperlink w:anchor="section_012">
+        <w:r>
+          <w:rPr>
+            <w:rStyle w:val="Hyperlink"/>
+          </w:rPr>
+          <w:t>Website Builder</w:t>
+        </w:r>
+      </w:hyperlink>
+    </w:p>
+    <w:p>
+      <w:pPr>
+        <w:spacing w:after="60"/>
+        <w:ind w:left="317"/>
+      </w:pPr>
+      <w:hyperlink w:anchor="section_013">
+        <w:r>
+          <w:rPr>
+            <w:rStyle w:val="Hyperlink"/>
+          </w:rPr>
+          <w:t>Files</w:t>
+        </w:r>
+      </w:hyperlink>
+    </w:p>
+    <w:p>
+      <w:pPr>
+        <w:spacing w:after="60"/>
+        <w:ind w:left="317"/>
+      </w:pPr>
+      <w:hyperlink w:anchor="section_014">
+        <w:r>
+          <w:rPr>
+            <w:rStyle w:val="Hyperlink"/>
+          </w:rPr>
+          <w:t>Reporting &amp; Analytics</w:t>
+        </w:r>
+      </w:hyperlink>
+    </w:p>
+    <w:p>
+      <w:pPr>
+        <w:spacing w:after="60"/>
+        <w:ind w:left="317"/>
+      </w:pPr>
+      <w:hyperlink w:anchor="section_015">
+        <w:r>
+          <w:rPr>
+            <w:rStyle w:val="Hyperlink"/>
+          </w:rPr>
+          <w:t>Notifications</w:t>
+        </w:r>
+      </w:hyperlink>
+    </w:p>
+    <w:p>
+      <w:pPr>
+        <w:spacing w:after="60"/>
+        <w:ind w:left="317"/>
+      </w:pPr>
+      <w:hyperlink w:anchor="section_016">
+        <w:r>
+          <w:rPr>
+            <w:rStyle w:val="Hyperlink"/>
+          </w:rPr>
+          <w:t>Organization &amp; Assets</w:t>
+        </w:r>
+      </w:hyperlink>
+    </w:p>
+    <w:p>
+      <w:pPr>
+        <w:spacing w:after="60"/>
+        <w:ind w:left="317"/>
+      </w:pPr>
+      <w:hyperlink w:anchor="section_017">
+        <w:r>
+          <w:rPr>
+            <w:rStyle w:val="Hyperlink"/>
+          </w:rPr>
+          <w:t>User &amp; Profile</w:t>
+        </w:r>
+      </w:hyperlink>
+    </w:p>
+    <w:p>
+      <w:pPr>
+        <w:spacing w:after="60"/>
+        <w:ind w:left="317"/>
+      </w:pPr>
+      <w:hyperlink w:anchor="section_018">
+        <w:r>
+          <w:rPr>
+            <w:rStyle w:val="Hyperlink"/>
+          </w:rPr>
+          <w:t>Tenant &amp; Settings</w:t>
+        </w:r>
+      </w:hyperlink>
+    </w:p>
+    <w:p>
+      <w:pPr>
+        <w:spacing w:after="60"/>
+        <w:ind w:left="317"/>
+      </w:pPr>
+      <w:hyperlink w:anchor="section_019">
+        <w:r>
+          <w:rPr>
+            <w:rStyle w:val="Hyperlink"/>
+          </w:rPr>
+          <w:t>Marketplace</w:t>
+        </w:r>
+      </w:hyperlink>
+    </w:p>
+    <w:p>
+      <w:pPr>
+        <w:spacing w:after="60"/>
+        <w:ind w:left="317"/>
+      </w:pPr>
+      <w:hyperlink w:anchor="section_020">
+        <w:r>
+          <w:rPr>
+            <w:rStyle w:val="Hyperlink"/>
+          </w:rPr>
+          <w:t>Security &amp; Compliance</w:t>
+        </w:r>
+      </w:hyperlink>
+    </w:p>
+    <w:p>
+      <w:pPr>
+        <w:spacing w:after="60"/>
+        <w:ind w:left="317"/>
+      </w:pPr>
+      <w:hyperlink w:anchor="section_021">
+        <w:r>
+          <w:rPr>
+            <w:rStyle w:val="Hyperlink"/>
+          </w:rPr>
+          <w:t>Privacy Operations (extensive)</w:t>
+        </w:r>
+      </w:hyperlink>
+    </w:p>
+    <w:p>
+      <w:pPr>
+        <w:spacing w:after="60"/>
+        <w:ind w:left="317"/>
+      </w:pPr>
+      <w:hyperlink w:anchor="section_022">
+        <w:r>
+          <w:rPr>
+            <w:rStyle w:val="Hyperlink"/>
+          </w:rPr>
+          <w:t>Platform Admin</w:t>
+        </w:r>
+      </w:hyperlink>
+    </w:p>
+    <w:p>
+      <w:pPr>
+        <w:spacing w:after="60"/>
+        <w:ind w:left="317"/>
+      </w:pPr>
+      <w:hyperlink w:anchor="section_023">
+        <w:r>
+          <w:rPr>
+            <w:rStyle w:val="Hyperlink"/>
+          </w:rPr>
+          <w:t>Phase-Based Enterprise Routes (dispatched)</w:t>
+        </w:r>
+      </w:hyperlink>
+    </w:p>
+    <w:p>
+      <w:pPr>
+        <w:spacing w:after="60"/>
+        <w:ind w:left="0"/>
+      </w:pPr>
+      <w:hyperlink w:anchor="section_024">
+        <w:r>
+          <w:rPr>
+            <w:rStyle w:val="Hyperlink"/>
+          </w:rPr>
+          <w:t>3. Major Feature Capabilities</w:t>
+        </w:r>
+      </w:hyperlink>
+    </w:p>
+    <w:p>
+      <w:pPr>
+        <w:spacing w:after="60"/>
+        <w:ind w:left="0"/>
+      </w:pPr>
+      <w:hyperlink w:anchor="section_025">
+        <w:r>
+          <w:rPr>
+            <w:rStyle w:val="Hyperlink"/>
+          </w:rPr>
+          <w:t>4. Frontend → Backend Mapping</w:t>
+        </w:r>
+      </w:hyperlink>
+    </w:p>
+    <w:p>
+      <w:pPr>
+        <w:spacing w:after="60"/>
+        <w:ind w:left="317"/>
+      </w:pPr>
+      <w:hyperlink w:anchor="section_026">
+        <w:r>
+          <w:rPr>
+            <w:rStyle w:val="Hyperlink"/>
+          </w:rPr>
+          <w:t>Shared Auth Flow</w:t>
+        </w:r>
+      </w:hyperlink>
+    </w:p>
+    <w:p>
+      <w:pPr>
+        <w:spacing w:after="60"/>
+        <w:ind w:left="317"/>
+      </w:pPr>
+      <w:hyperlink w:anchor="section_027">
+        <w:r>
+          <w:rPr>
+            <w:rStyle w:val="Hyperlink"/>
+          </w:rPr>
+          <w:t>Middleware Chain (every authenticated request)</w:t>
+        </w:r>
+      </w:hyperlink>
+    </w:p>
+    <w:p>
+      <w:pPr>
+        <w:spacing w:after="60"/>
+        <w:ind w:left="0"/>
+      </w:pPr>
+      <w:hyperlink w:anchor="section_028">
+        <w:r>
+          <w:rPr>
+            <w:rStyle w:val="Hyperlink"/>
+          </w:rPr>
+          <w:t>5. Documentation &amp; Test References</w:t>
+        </w:r>
+      </w:hyperlink>
+    </w:p>
+    <w:p>
+      <w:pPr>
+        <w:spacing w:after="60"/>
+        <w:ind w:left="317"/>
+      </w:pPr>
+      <w:hyperlink w:anchor="section_029">
+        <w:r>
+          <w:rPr>
+            <w:rStyle w:val="Hyperlink"/>
+          </w:rPr>
+          <w:t>Documentation (docs/)</w:t>
+        </w:r>
+      </w:hyperlink>
+    </w:p>
+    <w:p>
+      <w:pPr>
+        <w:spacing w:after="60"/>
+        <w:ind w:left="317"/>
+      </w:pPr>
+      <w:hyperlink w:anchor="section_030">
+        <w:r>
+          <w:rPr>
+            <w:rStyle w:val="Hyperlink"/>
+          </w:rPr>
+          <w:t>Tests (551 files in tests/)</w:t>
+        </w:r>
+      </w:hyperlink>
+    </w:p>
+    <w:p>
+      <w:pPr>
+        <w:spacing w:after="60"/>
+        <w:ind w:left="317"/>
+      </w:pPr>
+      <w:hyperlink w:anchor="section_031">
+        <w:r>
+          <w:rPr>
+            <w:rStyle w:val="Hyperlink"/>
+          </w:rPr>
+          <w:t>Key Config Files</w:t>
+        </w:r>
+      </w:hyperlink>
+    </w:p>
+    <w:p>
+      <w:pPr>
+        <w:spacing w:after="60"/>
+        <w:ind w:left="0"/>
+      </w:pPr>
+      <w:hyperlink w:anchor="section_032">
+        <w:r>
+          <w:rPr>
+            <w:rStyle w:val="Hyperlink"/>
+          </w:rPr>
+          <w:t>Summary Stats</w:t>
+        </w:r>
+      </w:hyperlink>
+    </w:p>
+    <w:p>
+      <w:r>
+        <w:br w:type="page"/>
       </w:r>
     </w:p>
     <w:p>
@@ -267,9 +745,11 @@
       <w:pPr>
         <w:pStyle w:val="Heading2"/>
       </w:pPr>
+      <w:bookmarkStart w:id="3" w:name="section_001"/>
       <w:r>
         <w:t>Public (no auth required) — 9 pages</w:t>
       </w:r>
+      <w:bookmarkEnd w:id="3"/>
     </w:p>
     <w:tbl>
       <w:tblPr>
@@ -730,9 +1210,11 @@
       <w:pPr>
         <w:pStyle w:val="Heading2"/>
       </w:pPr>
+      <w:bookmarkStart w:id="4" w:name="section_002"/>
       <w:r>
         <w:t>Authenticated (workspace layout) — 30 pages</w:t>
       </w:r>
+      <w:bookmarkEnd w:id="4"/>
     </w:p>
     <w:tbl>
       <w:tblPr>
@@ -2144,17 +2626,21 @@
       <w:pPr>
         <w:pStyle w:val="Heading1"/>
       </w:pPr>
+      <w:bookmarkStart w:id="5" w:name="section_003"/>
       <w:r>
         <w:t>2. Backend API Endpoints</w:t>
       </w:r>
+      <w:bookmarkEnd w:id="5"/>
     </w:p>
     <w:p>
       <w:pPr>
         <w:pStyle w:val="Heading2"/>
       </w:pPr>
+      <w:bookmarkStart w:id="6" w:name="section_004"/>
       <w:r>
         <w:t>Health (public, no auth)</w:t>
       </w:r>
+      <w:bookmarkEnd w:id="6"/>
     </w:p>
     <w:p>
       <w:pPr>
@@ -2176,9 +2662,11 @@
       <w:pPr>
         <w:pStyle w:val="Heading2"/>
       </w:pPr>
+      <w:bookmarkStart w:id="7" w:name="section_005"/>
       <w:r>
         <w:t>Auth (public, no auth)</w:t>
       </w:r>
+      <w:bookmarkEnd w:id="7"/>
     </w:p>
     <w:p>
       <w:pPr>
@@ -2248,9 +2736,11 @@
       <w:pPr>
         <w:pStyle w:val="Heading2"/>
       </w:pPr>
+      <w:bookmarkStart w:id="8" w:name="section_006"/>
       <w:r>
         <w:t>Public Storefront</w:t>
       </w:r>
+      <w:bookmarkEnd w:id="8"/>
     </w:p>
     <w:p>
       <w:pPr>
@@ -2280,9 +2770,11 @@
       <w:pPr>
         <w:pStyle w:val="Heading2"/>
       </w:pPr>
+      <w:bookmarkStart w:id="9" w:name="section_007"/>
       <w:r>
         <w:t>Customer Portal (portal auth)</w:t>
       </w:r>
+      <w:bookmarkEnd w:id="9"/>
     </w:p>
     <w:p>
       <w:pPr>
@@ -2336,9 +2828,11 @@
       <w:pPr>
         <w:pStyle w:val="Heading2"/>
       </w:pPr>
+      <w:bookmarkStart w:id="10" w:name="section_008"/>
       <w:r>
         <w:t>Core Business CRUD (authenticated, permission-gated)</w:t>
       </w:r>
+      <w:bookmarkEnd w:id="10"/>
     </w:p>
     <w:tbl>
       <w:tblPr>
@@ -3134,9 +3628,11 @@
       <w:pPr>
         <w:pStyle w:val="Heading2"/>
       </w:pPr>
+      <w:bookmarkStart w:id="11" w:name="section_009"/>
       <w:r>
         <w:t>CRM &amp; Marketing</w:t>
       </w:r>
+      <w:bookmarkEnd w:id="11"/>
     </w:p>
     <w:p>
       <w:pPr>
@@ -3158,9 +3654,11 @@
       <w:pPr>
         <w:pStyle w:val="Heading2"/>
       </w:pPr>
+      <w:bookmarkStart w:id="12" w:name="section_010"/>
       <w:r>
         <w:t>AI &amp; Knowledge</w:t>
       </w:r>
+      <w:bookmarkEnd w:id="12"/>
     </w:p>
     <w:p>
       <w:pPr>
@@ -3198,9 +3696,11 @@
       <w:pPr>
         <w:pStyle w:val="Heading2"/>
       </w:pPr>
+      <w:bookmarkStart w:id="13" w:name="section_011"/>
       <w:r>
         <w:t>Automation &amp; Workflows</w:t>
       </w:r>
+      <w:bookmarkEnd w:id="13"/>
     </w:p>
     <w:p>
       <w:pPr>
@@ -3246,9 +3746,11 @@
       <w:pPr>
         <w:pStyle w:val="Heading2"/>
       </w:pPr>
+      <w:bookmarkStart w:id="14" w:name="section_012"/>
       <w:r>
         <w:t>Website Builder</w:t>
       </w:r>
+      <w:bookmarkEnd w:id="14"/>
     </w:p>
     <w:p>
       <w:pPr>
@@ -3286,9 +3788,11 @@
       <w:pPr>
         <w:pStyle w:val="Heading2"/>
       </w:pPr>
+      <w:bookmarkStart w:id="15" w:name="section_013"/>
       <w:r>
         <w:t>Files</w:t>
       </w:r>
+      <w:bookmarkEnd w:id="15"/>
     </w:p>
     <w:p>
       <w:pPr>
@@ -3302,9 +3806,11 @@
       <w:pPr>
         <w:pStyle w:val="Heading2"/>
       </w:pPr>
+      <w:bookmarkStart w:id="16" w:name="section_014"/>
       <w:r>
         <w:t>Reporting &amp; Analytics</w:t>
       </w:r>
+      <w:bookmarkEnd w:id="16"/>
     </w:p>
     <w:p>
       <w:pPr>
@@ -3350,9 +3856,11 @@
       <w:pPr>
         <w:pStyle w:val="Heading2"/>
       </w:pPr>
+      <w:bookmarkStart w:id="17" w:name="section_015"/>
       <w:r>
         <w:t>Notifications</w:t>
       </w:r>
+      <w:bookmarkEnd w:id="17"/>
     </w:p>
     <w:p>
       <w:pPr>
@@ -3374,9 +3882,11 @@
       <w:pPr>
         <w:pStyle w:val="Heading2"/>
       </w:pPr>
+      <w:bookmarkStart w:id="18" w:name="section_016"/>
       <w:r>
         <w:t>Organization &amp; Assets</w:t>
       </w:r>
+      <w:bookmarkEnd w:id="18"/>
     </w:p>
     <w:p>
       <w:pPr>
@@ -3398,9 +3908,11 @@
       <w:pPr>
         <w:pStyle w:val="Heading2"/>
       </w:pPr>
+      <w:bookmarkStart w:id="19" w:name="section_017"/>
       <w:r>
         <w:t>User &amp; Profile</w:t>
       </w:r>
+      <w:bookmarkEnd w:id="19"/>
     </w:p>
     <w:p>
       <w:pPr>
@@ -3422,9 +3934,11 @@
       <w:pPr>
         <w:pStyle w:val="Heading2"/>
       </w:pPr>
+      <w:bookmarkStart w:id="20" w:name="section_018"/>
       <w:r>
         <w:t>Tenant &amp; Settings</w:t>
       </w:r>
+      <w:bookmarkEnd w:id="20"/>
     </w:p>
     <w:p>
       <w:pPr>
@@ -3470,9 +3984,11 @@
       <w:pPr>
         <w:pStyle w:val="Heading2"/>
       </w:pPr>
+      <w:bookmarkStart w:id="21" w:name="section_019"/>
       <w:r>
         <w:t>Marketplace</w:t>
       </w:r>
+      <w:bookmarkEnd w:id="21"/>
     </w:p>
     <w:p>
       <w:pPr>
@@ -3486,9 +4002,11 @@
       <w:pPr>
         <w:pStyle w:val="Heading2"/>
       </w:pPr>
+      <w:bookmarkStart w:id="22" w:name="section_020"/>
       <w:r>
         <w:t>Security &amp; Compliance</w:t>
       </w:r>
+      <w:bookmarkEnd w:id="22"/>
     </w:p>
     <w:p>
       <w:pPr>
@@ -3542,9 +4060,11 @@
       <w:pPr>
         <w:pStyle w:val="Heading2"/>
       </w:pPr>
+      <w:bookmarkStart w:id="23" w:name="section_021"/>
       <w:r>
         <w:t>Privacy Operations (extensive)</w:t>
       </w:r>
+      <w:bookmarkEnd w:id="23"/>
     </w:p>
     <w:p>
       <w:pPr>
@@ -3670,9 +4190,11 @@
       <w:pPr>
         <w:pStyle w:val="Heading2"/>
       </w:pPr>
+      <w:bookmarkStart w:id="24" w:name="section_022"/>
       <w:r>
         <w:t>Platform Admin</w:t>
       </w:r>
+      <w:bookmarkEnd w:id="24"/>
     </w:p>
     <w:p>
       <w:pPr>
@@ -3750,9 +4272,11 @@
       <w:pPr>
         <w:pStyle w:val="Heading2"/>
       </w:pPr>
+      <w:bookmarkStart w:id="25" w:name="section_023"/>
       <w:r>
         <w:t>Phase-Based Enterprise Routes (dispatched)</w:t>
       </w:r>
+      <w:bookmarkEnd w:id="25"/>
     </w:p>
     <w:tbl>
       <w:tblPr>
@@ -4618,9 +5142,11 @@
       <w:pPr>
         <w:pStyle w:val="Heading1"/>
       </w:pPr>
+      <w:bookmarkStart w:id="26" w:name="section_024"/>
       <w:r>
         <w:t>3. Major Feature Capabilities</w:t>
       </w:r>
+      <w:bookmarkEnd w:id="26"/>
     </w:p>
     <w:tbl>
       <w:tblPr>
@@ -6342,9 +6868,11 @@
       <w:pPr>
         <w:pStyle w:val="Heading1"/>
       </w:pPr>
+      <w:bookmarkStart w:id="27" w:name="section_025"/>
       <w:r>
         <w:t>4. Frontend → Backend Mapping</w:t>
       </w:r>
+      <w:bookmarkEnd w:id="27"/>
     </w:p>
     <w:tbl>
       <w:tblPr>
@@ -7579,9 +8107,11 @@
       <w:pPr>
         <w:pStyle w:val="Heading2"/>
       </w:pPr>
+      <w:bookmarkStart w:id="28" w:name="section_026"/>
       <w:r>
         <w:t>Shared Auth Flow</w:t>
       </w:r>
+      <w:bookmarkEnd w:id="28"/>
     </w:p>
     <w:p>
       <w:r>
@@ -7632,9 +8162,11 @@
       <w:pPr>
         <w:pStyle w:val="Heading2"/>
       </w:pPr>
+      <w:bookmarkStart w:id="29" w:name="section_027"/>
       <w:r>
         <w:t>Middleware Chain (every authenticated request)</w:t>
       </w:r>
+      <w:bookmarkEnd w:id="29"/>
     </w:p>
     <w:p>
       <w:pPr>
@@ -7741,17 +8273,21 @@
       <w:pPr>
         <w:pStyle w:val="Heading1"/>
       </w:pPr>
+      <w:bookmarkStart w:id="30" w:name="section_028"/>
       <w:r>
         <w:t>5. Documentation &amp; Test References</w:t>
       </w:r>
+      <w:bookmarkEnd w:id="30"/>
     </w:p>
     <w:p>
       <w:pPr>
         <w:pStyle w:val="Heading2"/>
       </w:pPr>
+      <w:bookmarkStart w:id="31" w:name="section_029"/>
       <w:r>
         <w:t>Documentation (docs/)</w:t>
       </w:r>
+      <w:bookmarkEnd w:id="31"/>
     </w:p>
     <w:p>
       <w:pPr>
@@ -7805,9 +8341,11 @@
       <w:pPr>
         <w:pStyle w:val="Heading2"/>
       </w:pPr>
+      <w:bookmarkStart w:id="32" w:name="section_030"/>
       <w:r>
         <w:t>Tests (551 files in tests/)</w:t>
       </w:r>
+      <w:bookmarkEnd w:id="32"/>
     </w:p>
     <w:p>
       <w:pPr>
@@ -7853,9 +8391,11 @@
       <w:pPr>
         <w:pStyle w:val="Heading2"/>
       </w:pPr>
+      <w:bookmarkStart w:id="33" w:name="section_031"/>
       <w:r>
         <w:t>Key Config Files</w:t>
       </w:r>
+      <w:bookmarkEnd w:id="33"/>
     </w:p>
     <w:p>
       <w:pPr>
@@ -7906,9 +8446,11 @@
       <w:pPr>
         <w:pStyle w:val="Heading1"/>
       </w:pPr>
+      <w:bookmarkStart w:id="34" w:name="section_032"/>
       <w:r>
         <w:t>Summary Stats</w:t>
       </w:r>
+      <w:bookmarkEnd w:id="34"/>
     </w:p>
     <w:tbl>
       <w:tblPr>

</xml_diff>